<commit_message>
Add data structures examples with filtering and mapping functionalities
</commit_message>
<xml_diff>
--- a/Actividad nueva profe Sabado.docx
+++ b/Actividad nueva profe Sabado.docx
@@ -23,7 +23,7 @@
                     <pic:cNvPicPr/>
                   </pic:nvPicPr>
                   <pic:blipFill>
-                    <a:blip r:embed="rId4"/>
+                    <a:blip r:embed="rId5"/>
                     <a:stretch>
                       <a:fillRect/>
                     </a:stretch>
@@ -65,7 +65,7 @@
                     <pic:cNvPicPr/>
                   </pic:nvPicPr>
                   <pic:blipFill>
-                    <a:blip r:embed="rId5"/>
+                    <a:blip r:embed="rId6"/>
                     <a:stretch>
                       <a:fillRect/>
                     </a:stretch>
@@ -108,7 +108,7 @@
                     <pic:cNvPicPr/>
                   </pic:nvPicPr>
                   <pic:blipFill>
-                    <a:blip r:embed="rId6"/>
+                    <a:blip r:embed="rId7"/>
                     <a:stretch>
                       <a:fillRect/>
                     </a:stretch>
@@ -131,7 +131,7 @@
     </w:p>
     <w:p/>
     <w:p>
-      <w:hyperlink r:id="rId7" w:tgtFrame="_blank" w:history="1">
+      <w:hyperlink r:id="rId8" w:tgtFrame="_blank" w:history="1">
         <w:r>
           <w:rPr>
             <w:rStyle w:val="Hipervnculo"/>
@@ -151,6 +151,1176 @@
     <w:p>
       <w:r>
         <w:t>"Actúa como Coach de Carrera IT. Analiza mi perfil: [Descripción]. Ayúdame a encontrar 2 oportunidades de empleo en Medellín que encajen con mis fortalezas y dime cómo mitigar mi mayor debilidad".</w:t>
+      </w:r>
+    </w:p>
+    <w:p/>
+    <w:p/>
+    <w:p/>
+    <w:p/>
+    <w:p>
+      <w:pPr>
+        <w:rPr>
+          <w:b/>
+          <w:bCs/>
+        </w:rPr>
+      </w:pPr>
+      <w:r>
+        <w:rPr>
+          <w:b/>
+          <w:bCs/>
+        </w:rPr>
+        <w:lastRenderedPageBreak/>
+        <w:t>Perfil Profesional (Resumen Ejecutivo)</w:t>
+      </w:r>
+    </w:p>
+    <w:p>
+      <w:r>
+        <w:t xml:space="preserve">Soy un </w:t>
+      </w:r>
+      <w:r>
+        <w:rPr>
+          <w:b/>
+          <w:bCs/>
+        </w:rPr>
+        <w:t>Ingeniero Civil</w:t>
+      </w:r>
+      <w:r>
+        <w:t xml:space="preserve"> que ha evolucionado durante los últimos </w:t>
+      </w:r>
+      <w:r>
+        <w:rPr>
+          <w:b/>
+          <w:bCs/>
+        </w:rPr>
+        <w:t>5 años</w:t>
+      </w:r>
+      <w:r>
+        <w:t xml:space="preserve"> en el ecosistema de desarrollo de software. Mi especialidad es la creación de aplicaciones de escritorio de alto rendimiento para el </w:t>
+      </w:r>
+      <w:r>
+        <w:rPr>
+          <w:b/>
+          <w:bCs/>
+        </w:rPr>
+        <w:t>diseño estructural</w:t>
+      </w:r>
+      <w:r>
+        <w:t xml:space="preserve">, utilizando el entorno </w:t>
+      </w:r>
+      <w:r>
+        <w:rPr>
+          <w:b/>
+          <w:bCs/>
+        </w:rPr>
+        <w:t>.NET (C#, VB.NET)</w:t>
+      </w:r>
+      <w:r>
+        <w:t xml:space="preserve"> y la arquitectura </w:t>
+      </w:r>
+      <w:r>
+        <w:rPr>
+          <w:b/>
+          <w:bCs/>
+        </w:rPr>
+        <w:t>MVVM (WPF, WinUI3)</w:t>
+      </w:r>
+      <w:r>
+        <w:t>.</w:t>
+      </w:r>
+    </w:p>
+    <w:p>
+      <w:r>
+        <w:t xml:space="preserve">Combino el rigor técnico de la ingeniería tradicional con prácticas modernas de desarrollo, como el control de versiones con </w:t>
+      </w:r>
+      <w:r>
+        <w:rPr>
+          <w:b/>
+          <w:bCs/>
+        </w:rPr>
+        <w:t>Git/GitHub</w:t>
+      </w:r>
+      <w:r>
+        <w:t xml:space="preserve"> y la gestión de infraestructura en la nube como </w:t>
+      </w:r>
+      <w:r>
+        <w:rPr>
+          <w:b/>
+          <w:bCs/>
+        </w:rPr>
+        <w:t>AWS Cloud Practitioner</w:t>
+      </w:r>
+      <w:r>
+        <w:t xml:space="preserve">. Actualmente, estoy expandiendo mi stack hacia el </w:t>
+      </w:r>
+      <w:r>
+        <w:rPr>
+          <w:b/>
+          <w:bCs/>
+        </w:rPr>
+        <w:t>backend con Python</w:t>
+      </w:r>
+      <w:r>
+        <w:t xml:space="preserve">, la contenedorización con </w:t>
+      </w:r>
+      <w:r>
+        <w:rPr>
+          <w:b/>
+          <w:bCs/>
+        </w:rPr>
+        <w:t>Docker</w:t>
+      </w:r>
+      <w:r>
+        <w:t xml:space="preserve"> y la automatización de procesos con </w:t>
+      </w:r>
+      <w:r>
+        <w:rPr>
+          <w:b/>
+          <w:bCs/>
+        </w:rPr>
+        <w:t>n8n</w:t>
+      </w:r>
+      <w:r>
+        <w:t>.</w:t>
+      </w:r>
+    </w:p>
+    <w:p/>
+    <w:p>
+      <w:pPr>
+        <w:rPr>
+          <w:b/>
+          <w:bCs/>
+        </w:rPr>
+      </w:pPr>
+      <w:r>
+        <w:rPr>
+          <w:b/>
+          <w:bCs/>
+        </w:rPr>
+        <w:t>Propuesta de Valor (ADN)</w:t>
+      </w:r>
+    </w:p>
+    <w:p>
+      <w:r>
+        <w:t>Estas son las dos frases que definen mi impacto en el mercado:</w:t>
+      </w:r>
+    </w:p>
+    <w:p>
+      <w:pPr>
+        <w:numPr>
+          <w:ilvl w:val="0"/>
+          <w:numId w:val="1"/>
+        </w:numPr>
+      </w:pPr>
+      <w:r>
+        <w:rPr>
+          <w:b/>
+          <w:bCs/>
+        </w:rPr>
+        <w:t>Impacto Técnico:</w:t>
+      </w:r>
+      <w:r>
+        <w:t xml:space="preserve"> "Transformo la complejidad del cálculo estructural en herramientas digitales precisas y eficientes, cerrando la brecha entre la ingeniería civil y el software de vanguardia".</w:t>
+      </w:r>
+    </w:p>
+    <w:p>
+      <w:pPr>
+        <w:numPr>
+          <w:ilvl w:val="0"/>
+          <w:numId w:val="1"/>
+        </w:numPr>
+      </w:pPr>
+      <w:r>
+        <w:rPr>
+          <w:b/>
+          <w:bCs/>
+        </w:rPr>
+        <w:t>Visión de Futuro:</w:t>
+      </w:r>
+      <w:r>
+        <w:t xml:space="preserve"> "Integro mi experiencia en diseño de infraestructura con arquitecturas escalables en la nube y automatización, garantizando soluciones que son técnicamente íntegras y operativamente modernas".</w:t>
+      </w:r>
+    </w:p>
+    <w:p/>
+    <w:p>
+      <w:pPr>
+        <w:rPr>
+          <w:lang w:val="en-US"/>
+        </w:rPr>
+      </w:pPr>
+      <w:r>
+        <w:rPr>
+          <w:b/>
+          <w:bCs/>
+          <w:lang w:val="en-US"/>
+        </w:rPr>
+        <w:t>Sebastian Vargas Suarez | .NET Developer &amp; Civil Engineer</w:t>
+      </w:r>
+    </w:p>
+    <w:p>
+      <w:r>
+        <w:rPr>
+          <w:b/>
+          <w:bCs/>
+        </w:rPr>
+        <w:t>Lo que hago:</w:t>
+      </w:r>
+      <w:r>
+        <w:t xml:space="preserve"> Desarrollo software especializado para diseño estructural bajo entorno .NET (C#/VB.NET) y arquitectura MVVM.</w:t>
+      </w:r>
+    </w:p>
+    <w:p>
+      <w:r>
+        <w:rPr>
+          <w:rFonts w:ascii="Segoe UI Emoji" w:hAnsi="Segoe UI Emoji" w:cs="Segoe UI Emoji"/>
+        </w:rPr>
+        <w:t>✨</w:t>
+      </w:r>
+      <w:r>
+        <w:t xml:space="preserve"> </w:t>
+      </w:r>
+      <w:r>
+        <w:rPr>
+          <w:b/>
+          <w:bCs/>
+        </w:rPr>
+        <w:t>Mi propuesta de valor:</w:t>
+      </w:r>
+    </w:p>
+    <w:p>
+      <w:pPr>
+        <w:numPr>
+          <w:ilvl w:val="0"/>
+          <w:numId w:val="2"/>
+        </w:numPr>
+      </w:pPr>
+      <w:r>
+        <w:t>Transformo cálculos de ingeniería complejos en herramientas digitales de alta precisión.</w:t>
+      </w:r>
+    </w:p>
+    <w:p>
+      <w:pPr>
+        <w:numPr>
+          <w:ilvl w:val="0"/>
+          <w:numId w:val="2"/>
+        </w:numPr>
+      </w:pPr>
+      <w:r>
+        <w:t>Fusiono el rigor de la construcción civil con la escalabilidad de la nube (AWS) y la automatización de flujos de trabajo.</w:t>
+      </w:r>
+    </w:p>
+    <w:p>
+      <w:pPr>
+        <w:rPr>
+          <w:lang w:val="en-US"/>
+        </w:rPr>
+      </w:pPr>
+      <w:r>
+        <w:rPr>
+          <w:rFonts w:ascii="Segoe UI Emoji" w:hAnsi="Segoe UI Emoji" w:cs="Segoe UI Emoji"/>
+        </w:rPr>
+        <w:t>📍</w:t>
+      </w:r>
+      <w:r>
+        <w:rPr>
+          <w:lang w:val="en-US"/>
+        </w:rPr>
+        <w:t xml:space="preserve"> Medellín, Colombia | AWS Practitioner | Docker &amp; Python Enthusiast.</w:t>
+      </w:r>
+    </w:p>
+    <w:p>
+      <w:pPr>
+        <w:rPr>
+          <w:lang w:val="en-US"/>
+        </w:rPr>
+      </w:pPr>
+    </w:p>
+    <w:p>
+      <w:pPr>
+        <w:rPr>
+          <w:lang w:val="en-US"/>
+        </w:rPr>
+      </w:pPr>
+    </w:p>
+    <w:p>
+      <w:pPr>
+        <w:rPr>
+          <w:lang w:val="en-US"/>
+        </w:rPr>
+      </w:pPr>
+      <w:r>
+        <w:rPr>
+          <w:b/>
+          <w:bCs/>
+          <w:lang w:val="en-US"/>
+        </w:rPr>
+        <w:t>Sebastian Vargas Suarez | .NET Developer &amp; Civil Engineer</w:t>
+      </w:r>
+    </w:p>
+    <w:p>
+      <w:r>
+        <w:rPr>
+          <w:b/>
+          <w:bCs/>
+        </w:rPr>
+        <w:t>Lo que hago:</w:t>
+      </w:r>
+      <w:r>
+        <w:t xml:space="preserve"> Desarrollo software especializado para diseño estructural bajo entorno .NET y arquitectura MVVM</w:t>
+      </w:r>
+      <w:r>
+        <w:t>, Backend</w:t>
+      </w:r>
+      <w:r>
+        <w:t>.</w:t>
+      </w:r>
+    </w:p>
+    <w:p>
+      <w:r>
+        <w:t xml:space="preserve"> </w:t>
+      </w:r>
+      <w:r>
+        <w:rPr>
+          <w:b/>
+          <w:bCs/>
+        </w:rPr>
+        <w:t>Mi propuesta de valor:</w:t>
+      </w:r>
+    </w:p>
+    <w:p>
+      <w:pPr>
+        <w:numPr>
+          <w:ilvl w:val="0"/>
+          <w:numId w:val="3"/>
+        </w:numPr>
+      </w:pPr>
+      <w:r>
+        <w:lastRenderedPageBreak/>
+        <w:t>Transformo cálculos de ingeniería complejos en herramientas digitales de alta precisión.</w:t>
+      </w:r>
+    </w:p>
+    <w:p>
+      <w:pPr>
+        <w:numPr>
+          <w:ilvl w:val="0"/>
+          <w:numId w:val="3"/>
+        </w:numPr>
+      </w:pPr>
+      <w:r>
+        <w:rPr>
+          <w:b/>
+          <w:bCs/>
+        </w:rPr>
+        <w:t>Automatizo la generación de planos estructurales mediante código</w:t>
+      </w:r>
+      <w:r>
+        <w:t>, optimizando radicalmente los tiempos de entrega y eliminando el error humano en procesos manuales.</w:t>
+      </w:r>
+    </w:p>
+    <w:p>
+      <w:r>
+        <w:t xml:space="preserve"> Medellín, Colombia | C# &amp; .NET Expert | Automation &amp; Python Learner.</w:t>
+      </w:r>
+    </w:p>
+    <w:p>
+      <w:pPr>
+        <w:rPr>
+          <w:lang w:val="en-US"/>
+        </w:rPr>
+      </w:pPr>
+    </w:p>
+    <w:p>
+      <w:pPr>
+        <w:rPr>
+          <w:lang w:val="en-US"/>
+        </w:rPr>
+      </w:pPr>
+    </w:p>
+    <w:p>
+      <w:pPr>
+        <w:rPr>
+          <w:lang w:val="en-US"/>
+        </w:rPr>
+      </w:pPr>
+      <w:r>
+        <w:rPr>
+          <w:lang w:val="en-US"/>
+        </w:rPr>
+        <w:drawing>
+          <wp:inline distT="0" distB="0" distL="0" distR="0" wp14:anchorId="55F694FF" wp14:editId="6FBEDAC4">
+            <wp:extent cx="5410955" cy="809738"/>
+            <wp:effectExtent l="0" t="0" r="0" b="9525"/>
+            <wp:docPr id="470857997" name="Imagen 1"/>
+            <wp:cNvGraphicFramePr>
+              <a:graphicFrameLocks xmlns:a="http://schemas.openxmlformats.org/drawingml/2006/main" noChangeAspect="1"/>
+            </wp:cNvGraphicFramePr>
+            <a:graphic xmlns:a="http://schemas.openxmlformats.org/drawingml/2006/main">
+              <a:graphicData uri="http://schemas.openxmlformats.org/drawingml/2006/picture">
+                <pic:pic xmlns:pic="http://schemas.openxmlformats.org/drawingml/2006/picture">
+                  <pic:nvPicPr>
+                    <pic:cNvPr id="470857997" name=""/>
+                    <pic:cNvPicPr/>
+                  </pic:nvPicPr>
+                  <pic:blipFill>
+                    <a:blip r:embed="rId9"/>
+                    <a:stretch>
+                      <a:fillRect/>
+                    </a:stretch>
+                  </pic:blipFill>
+                  <pic:spPr>
+                    <a:xfrm>
+                      <a:off x="0" y="0"/>
+                      <a:ext cx="5410955" cy="809738"/>
+                    </a:xfrm>
+                    <a:prstGeom prst="rect">
+                      <a:avLst/>
+                    </a:prstGeom>
+                  </pic:spPr>
+                </pic:pic>
+              </a:graphicData>
+            </a:graphic>
+          </wp:inline>
+        </w:drawing>
+      </w:r>
+    </w:p>
+    <w:p>
+      <w:pPr>
+        <w:rPr>
+          <w:lang w:val="en-US"/>
+        </w:rPr>
+      </w:pPr>
+    </w:p>
+    <w:p>
+      <w:pPr>
+        <w:rPr>
+          <w:lang w:val="en-US"/>
+        </w:rPr>
+      </w:pPr>
+      <w:r>
+        <w:rPr>
+          <w:lang w:val="en-US"/>
+        </w:rPr>
+        <w:drawing>
+          <wp:inline distT="0" distB="0" distL="0" distR="0" wp14:anchorId="20AF3049" wp14:editId="28CC82BF">
+            <wp:extent cx="5612130" cy="5105400"/>
+            <wp:effectExtent l="0" t="0" r="7620" b="0"/>
+            <wp:docPr id="828601558" name="Imagen 1"/>
+            <wp:cNvGraphicFramePr>
+              <a:graphicFrameLocks xmlns:a="http://schemas.openxmlformats.org/drawingml/2006/main" noChangeAspect="1"/>
+            </wp:cNvGraphicFramePr>
+            <a:graphic xmlns:a="http://schemas.openxmlformats.org/drawingml/2006/main">
+              <a:graphicData uri="http://schemas.openxmlformats.org/drawingml/2006/picture">
+                <pic:pic xmlns:pic="http://schemas.openxmlformats.org/drawingml/2006/picture">
+                  <pic:nvPicPr>
+                    <pic:cNvPr id="828601558" name=""/>
+                    <pic:cNvPicPr/>
+                  </pic:nvPicPr>
+                  <pic:blipFill>
+                    <a:blip r:embed="rId10"/>
+                    <a:stretch>
+                      <a:fillRect/>
+                    </a:stretch>
+                  </pic:blipFill>
+                  <pic:spPr>
+                    <a:xfrm>
+                      <a:off x="0" y="0"/>
+                      <a:ext cx="5612130" cy="5105400"/>
+                    </a:xfrm>
+                    <a:prstGeom prst="rect">
+                      <a:avLst/>
+                    </a:prstGeom>
+                  </pic:spPr>
+                </pic:pic>
+              </a:graphicData>
+            </a:graphic>
+          </wp:inline>
+        </w:drawing>
+      </w:r>
+    </w:p>
+    <w:p>
+      <w:pPr>
+        <w:rPr>
+          <w:lang w:val="en-US"/>
+        </w:rPr>
+      </w:pPr>
+    </w:p>
+    <w:p>
+      <w:pPr>
+        <w:rPr>
+          <w:lang w:val="en-US"/>
+        </w:rPr>
+      </w:pPr>
+      <w:r>
+        <w:rPr>
+          <w:lang w:val="en-US"/>
+        </w:rPr>
+        <w:lastRenderedPageBreak/>
+        <w:drawing>
+          <wp:inline distT="0" distB="0" distL="0" distR="0" wp14:anchorId="2C2AB2F7" wp14:editId="52C558A4">
+            <wp:extent cx="5612130" cy="2764790"/>
+            <wp:effectExtent l="0" t="0" r="7620" b="0"/>
+            <wp:docPr id="1117131321" name="Imagen 1"/>
+            <wp:cNvGraphicFramePr>
+              <a:graphicFrameLocks xmlns:a="http://schemas.openxmlformats.org/drawingml/2006/main" noChangeAspect="1"/>
+            </wp:cNvGraphicFramePr>
+            <a:graphic xmlns:a="http://schemas.openxmlformats.org/drawingml/2006/main">
+              <a:graphicData uri="http://schemas.openxmlformats.org/drawingml/2006/picture">
+                <pic:pic xmlns:pic="http://schemas.openxmlformats.org/drawingml/2006/picture">
+                  <pic:nvPicPr>
+                    <pic:cNvPr id="1117131321" name=""/>
+                    <pic:cNvPicPr/>
+                  </pic:nvPicPr>
+                  <pic:blipFill>
+                    <a:blip r:embed="rId11"/>
+                    <a:stretch>
+                      <a:fillRect/>
+                    </a:stretch>
+                  </pic:blipFill>
+                  <pic:spPr>
+                    <a:xfrm>
+                      <a:off x="0" y="0"/>
+                      <a:ext cx="5612130" cy="2764790"/>
+                    </a:xfrm>
+                    <a:prstGeom prst="rect">
+                      <a:avLst/>
+                    </a:prstGeom>
+                  </pic:spPr>
+                </pic:pic>
+              </a:graphicData>
+            </a:graphic>
+          </wp:inline>
+        </w:drawing>
+      </w:r>
+    </w:p>
+    <w:p>
+      <w:pPr>
+        <w:rPr>
+          <w:lang w:val="en-US"/>
+        </w:rPr>
+      </w:pPr>
+      <w:r>
+        <w:rPr>
+          <w:lang w:val="en-US"/>
+        </w:rPr>
+        <w:drawing>
+          <wp:inline distT="0" distB="0" distL="0" distR="0" wp14:anchorId="247F4705" wp14:editId="41D44B8E">
+            <wp:extent cx="4220164" cy="2838846"/>
+            <wp:effectExtent l="0" t="0" r="9525" b="0"/>
+            <wp:docPr id="1464955960" name="Imagen 1"/>
+            <wp:cNvGraphicFramePr>
+              <a:graphicFrameLocks xmlns:a="http://schemas.openxmlformats.org/drawingml/2006/main" noChangeAspect="1"/>
+            </wp:cNvGraphicFramePr>
+            <a:graphic xmlns:a="http://schemas.openxmlformats.org/drawingml/2006/main">
+              <a:graphicData uri="http://schemas.openxmlformats.org/drawingml/2006/picture">
+                <pic:pic xmlns:pic="http://schemas.openxmlformats.org/drawingml/2006/picture">
+                  <pic:nvPicPr>
+                    <pic:cNvPr id="1464955960" name=""/>
+                    <pic:cNvPicPr/>
+                  </pic:nvPicPr>
+                  <pic:blipFill>
+                    <a:blip r:embed="rId12"/>
+                    <a:stretch>
+                      <a:fillRect/>
+                    </a:stretch>
+                  </pic:blipFill>
+                  <pic:spPr>
+                    <a:xfrm>
+                      <a:off x="0" y="0"/>
+                      <a:ext cx="4220164" cy="2838846"/>
+                    </a:xfrm>
+                    <a:prstGeom prst="rect">
+                      <a:avLst/>
+                    </a:prstGeom>
+                  </pic:spPr>
+                </pic:pic>
+              </a:graphicData>
+            </a:graphic>
+          </wp:inline>
+        </w:drawing>
+      </w:r>
+    </w:p>
+    <w:p>
+      <w:pPr>
+        <w:rPr>
+          <w:lang w:val="en-US"/>
+        </w:rPr>
+      </w:pPr>
+      <w:r>
+        <w:rPr>
+          <w:lang w:val="en-US"/>
+        </w:rPr>
+        <w:lastRenderedPageBreak/>
+        <w:drawing>
+          <wp:inline distT="0" distB="0" distL="0" distR="0" wp14:anchorId="673D0E37" wp14:editId="2C5749D8">
+            <wp:extent cx="4353533" cy="2772162"/>
+            <wp:effectExtent l="0" t="0" r="9525" b="9525"/>
+            <wp:docPr id="548821963" name="Imagen 1"/>
+            <wp:cNvGraphicFramePr>
+              <a:graphicFrameLocks xmlns:a="http://schemas.openxmlformats.org/drawingml/2006/main" noChangeAspect="1"/>
+            </wp:cNvGraphicFramePr>
+            <a:graphic xmlns:a="http://schemas.openxmlformats.org/drawingml/2006/main">
+              <a:graphicData uri="http://schemas.openxmlformats.org/drawingml/2006/picture">
+                <pic:pic xmlns:pic="http://schemas.openxmlformats.org/drawingml/2006/picture">
+                  <pic:nvPicPr>
+                    <pic:cNvPr id="548821963" name=""/>
+                    <pic:cNvPicPr/>
+                  </pic:nvPicPr>
+                  <pic:blipFill>
+                    <a:blip r:embed="rId13"/>
+                    <a:stretch>
+                      <a:fillRect/>
+                    </a:stretch>
+                  </pic:blipFill>
+                  <pic:spPr>
+                    <a:xfrm>
+                      <a:off x="0" y="0"/>
+                      <a:ext cx="4353533" cy="2772162"/>
+                    </a:xfrm>
+                    <a:prstGeom prst="rect">
+                      <a:avLst/>
+                    </a:prstGeom>
+                  </pic:spPr>
+                </pic:pic>
+              </a:graphicData>
+            </a:graphic>
+          </wp:inline>
+        </w:drawing>
+      </w:r>
+    </w:p>
+    <w:p>
+      <w:pPr>
+        <w:rPr>
+          <w:lang w:val="en-US"/>
+        </w:rPr>
+      </w:pPr>
+      <w:r>
+        <w:rPr>
+          <w:lang w:val="en-US"/>
+        </w:rPr>
+        <w:drawing>
+          <wp:inline distT="0" distB="0" distL="0" distR="0" wp14:anchorId="6A150DED" wp14:editId="44C41EF4">
+            <wp:extent cx="4010585" cy="2648320"/>
+            <wp:effectExtent l="0" t="0" r="9525" b="0"/>
+            <wp:docPr id="1397485335" name="Imagen 1"/>
+            <wp:cNvGraphicFramePr>
+              <a:graphicFrameLocks xmlns:a="http://schemas.openxmlformats.org/drawingml/2006/main" noChangeAspect="1"/>
+            </wp:cNvGraphicFramePr>
+            <a:graphic xmlns:a="http://schemas.openxmlformats.org/drawingml/2006/main">
+              <a:graphicData uri="http://schemas.openxmlformats.org/drawingml/2006/picture">
+                <pic:pic xmlns:pic="http://schemas.openxmlformats.org/drawingml/2006/picture">
+                  <pic:nvPicPr>
+                    <pic:cNvPr id="1397485335" name=""/>
+                    <pic:cNvPicPr/>
+                  </pic:nvPicPr>
+                  <pic:blipFill>
+                    <a:blip r:embed="rId14"/>
+                    <a:stretch>
+                      <a:fillRect/>
+                    </a:stretch>
+                  </pic:blipFill>
+                  <pic:spPr>
+                    <a:xfrm>
+                      <a:off x="0" y="0"/>
+                      <a:ext cx="4010585" cy="2648320"/>
+                    </a:xfrm>
+                    <a:prstGeom prst="rect">
+                      <a:avLst/>
+                    </a:prstGeom>
+                  </pic:spPr>
+                </pic:pic>
+              </a:graphicData>
+            </a:graphic>
+          </wp:inline>
+        </w:drawing>
+      </w:r>
+    </w:p>
+    <w:p>
+      <w:pPr>
+        <w:rPr>
+          <w:lang w:val="en-US"/>
+        </w:rPr>
+      </w:pPr>
+    </w:p>
+    <w:p>
+      <w:pPr>
+        <w:rPr>
+          <w:lang w:val="en-US"/>
+        </w:rPr>
+      </w:pPr>
+    </w:p>
+    <w:p>
+      <w:pPr>
+        <w:rPr>
+          <w:b/>
+          <w:bCs/>
+        </w:rPr>
+      </w:pPr>
+      <w:r>
+        <w:rPr>
+          <w:b/>
+          <w:bCs/>
+        </w:rPr>
+        <w:t>Acerca de</w:t>
+      </w:r>
+    </w:p>
+    <w:p>
+      <w:r>
+        <w:rPr>
+          <w:b/>
+          <w:bCs/>
+        </w:rPr>
+        <w:t xml:space="preserve">Construyendo </w:t>
+      </w:r>
+      <w:r>
+        <w:rPr>
+          <w:b/>
+          <w:bCs/>
+        </w:rPr>
+        <w:t>conexiones</w:t>
+      </w:r>
+      <w:r>
+        <w:rPr>
+          <w:b/>
+          <w:bCs/>
+        </w:rPr>
+        <w:t xml:space="preserve"> entre la infraestructura física y la arquitectura digital.</w:t>
+      </w:r>
+    </w:p>
+    <w:p>
+      <w:r>
+        <w:t xml:space="preserve">Mi trayectoria profesional comenzó con una fascinación por la </w:t>
+      </w:r>
+      <w:r>
+        <w:rPr>
+          <w:b/>
+          <w:bCs/>
+        </w:rPr>
+        <w:t>Ingeniería Civil</w:t>
+      </w:r>
+      <w:r>
+        <w:t xml:space="preserve">: la capacidad de resolver problemas complejos de estructuras y eficiencia en el mundo real. Sin embargo, </w:t>
+      </w:r>
+      <w:r>
+        <w:t xml:space="preserve">terminé descubriendo </w:t>
+      </w:r>
+      <w:r>
+        <w:t xml:space="preserve">que mi verdadera pasión reside en aplicar esa misma rigurosidad analítica al mundo del </w:t>
+      </w:r>
+      <w:r>
+        <w:rPr>
+          <w:b/>
+          <w:bCs/>
+        </w:rPr>
+        <w:t>Desarrollo Backend</w:t>
+      </w:r>
+      <w:r>
+        <w:t>.</w:t>
+      </w:r>
+    </w:p>
+    <w:p>
+      <w:r>
+        <w:t xml:space="preserve">Hoy, utilizo mi formación como ingeniero para diseñar </w:t>
+      </w:r>
+      <w:r>
+        <w:t>aplicaciones</w:t>
+      </w:r>
+      <w:r>
+        <w:t xml:space="preserve"> robust</w:t>
+      </w:r>
+      <w:r>
+        <w:t>a</w:t>
+      </w:r>
+      <w:r>
+        <w:t>s, escalables y segur</w:t>
+      </w:r>
+      <w:r>
+        <w:t>a</w:t>
+      </w:r>
+      <w:r>
+        <w:t xml:space="preserve">s. Entiendo que, al igual que un </w:t>
+      </w:r>
+      <w:r>
+        <w:t>edificio</w:t>
+      </w:r>
+      <w:r>
+        <w:t xml:space="preserve"> necesita cimientos sólidos, una ap</w:t>
+      </w:r>
+      <w:r>
+        <w:t>p</w:t>
+      </w:r>
+      <w:r>
+        <w:t xml:space="preserve"> requiere un backend impecable para sostener el peso de</w:t>
+      </w:r>
+      <w:r>
+        <w:t xml:space="preserve"> cientos de cálculos</w:t>
+      </w:r>
+      <w:r>
+        <w:t xml:space="preserve"> y</w:t>
+      </w:r>
+      <w:r>
+        <w:t xml:space="preserve"> la gran variedad de usuarios que lo usan</w:t>
+      </w:r>
+      <w:r>
+        <w:t>.</w:t>
+      </w:r>
+    </w:p>
+    <w:p>
+      <w:r>
+        <w:lastRenderedPageBreak/>
+        <w:t>Me especializo en optimizar procesos y automatizar soluciones que antes parecían imposibles. Disfruto el reto de tomar un problema de ingeniería y traducirlo a una lógica de programación eficiente que aporte valor real al negocio.</w:t>
+      </w:r>
+    </w:p>
+    <w:p/>
+    <w:p>
+      <w:r>
+        <w:t>Hablamos?</w:t>
+      </w:r>
+    </w:p>
+    <w:p>
+      <w:r>
+        <w:t>Siempre estoy abierto a conectar con mentes innovadoras, ingenieros que busquen digitalizar sus procesos o equipos que necesiten un desarrollador backend con una visión estructural única.</w:t>
+      </w:r>
+    </w:p>
+    <w:p/>
+    <w:p/>
+    <w:p>
+      <w:pPr>
+        <w:rPr>
+          <w:b/>
+          <w:bCs/>
+        </w:rPr>
+      </w:pPr>
+      <w:r>
+        <w:rPr>
+          <w:b/>
+          <w:bCs/>
+        </w:rPr>
+        <w:t>Mi Stack Tecnológico</w:t>
+      </w:r>
+    </w:p>
+    <w:p>
+      <w:r>
+        <w:t>He construido un conjunto de habilidades diseñado para la robustez y la integración:</w:t>
+      </w:r>
+    </w:p>
+    <w:p>
+      <w:pPr>
+        <w:numPr>
+          <w:ilvl w:val="0"/>
+          <w:numId w:val="4"/>
+        </w:numPr>
+        <w:rPr>
+          <w:lang w:val="en-US"/>
+        </w:rPr>
+      </w:pPr>
+      <w:r>
+        <w:rPr>
+          <w:b/>
+          <w:bCs/>
+          <w:lang w:val="en-US"/>
+        </w:rPr>
+        <w:t>Lenguajes:</w:t>
+      </w:r>
+      <w:r>
+        <w:rPr>
+          <w:lang w:val="en-US"/>
+        </w:rPr>
+        <w:t xml:space="preserve"> $C\#, VB.NET$, Python (Backend/Data), $SQL$, JavaScript.</w:t>
+      </w:r>
+    </w:p>
+    <w:p>
+      <w:pPr>
+        <w:numPr>
+          <w:ilvl w:val="0"/>
+          <w:numId w:val="4"/>
+        </w:numPr>
+        <w:rPr>
+          <w:lang w:val="en-US"/>
+        </w:rPr>
+      </w:pPr>
+      <w:r>
+        <w:rPr>
+          <w:b/>
+          <w:bCs/>
+          <w:lang w:val="en-US"/>
+        </w:rPr>
+        <w:t>Frameworks &amp; Desktop:</w:t>
+      </w:r>
+      <w:r>
+        <w:rPr>
+          <w:lang w:val="en-US"/>
+        </w:rPr>
+        <w:t xml:space="preserve"> .NET Core, .NET Framework, WPF, WinUI 3, MVVM Pattern, Entity Framework.</w:t>
+      </w:r>
+    </w:p>
+    <w:p>
+      <w:pPr>
+        <w:numPr>
+          <w:ilvl w:val="0"/>
+          <w:numId w:val="4"/>
+        </w:numPr>
+      </w:pPr>
+      <w:r>
+        <w:rPr>
+          <w:b/>
+          <w:bCs/>
+        </w:rPr>
+        <w:t>Cloud &amp; DevOps:</w:t>
+      </w:r>
+      <w:r>
+        <w:t xml:space="preserve"> AWS (EC2, S3, RDS, IAM), Docker, Git, CI/CD, n8n (Automatización de flujos).</w:t>
+      </w:r>
+    </w:p>
+    <w:p>
+      <w:pPr>
+        <w:numPr>
+          <w:ilvl w:val="0"/>
+          <w:numId w:val="4"/>
+        </w:numPr>
+      </w:pPr>
+      <w:r>
+        <w:rPr>
+          <w:b/>
+          <w:bCs/>
+        </w:rPr>
+        <w:t>Bases de Datos:</w:t>
+      </w:r>
+      <w:r>
+        <w:t xml:space="preserve"> SQL Server, MySQL, MariaDB (Diseño relacional y procedimientos almacenados).</w:t>
+      </w:r>
+    </w:p>
+    <w:p>
+      <w:pPr>
+        <w:numPr>
+          <w:ilvl w:val="0"/>
+          <w:numId w:val="4"/>
+        </w:numPr>
+        <w:rPr>
+          <w:lang w:val="en-US"/>
+        </w:rPr>
+      </w:pPr>
+      <w:r>
+        <w:rPr>
+          <w:b/>
+          <w:bCs/>
+          <w:lang w:val="en-US"/>
+        </w:rPr>
+        <w:t>Frontend:</w:t>
+      </w:r>
+      <w:r>
+        <w:rPr>
+          <w:lang w:val="en-US"/>
+        </w:rPr>
+        <w:t xml:space="preserve"> React (Básico), Tailwind CSS, API Integration.</w:t>
+      </w:r>
+    </w:p>
+    <w:p>
+      <w:pPr>
+        <w:numPr>
+          <w:ilvl w:val="0"/>
+          <w:numId w:val="4"/>
+        </w:numPr>
+      </w:pPr>
+      <w:r>
+        <w:rPr>
+          <w:b/>
+          <w:bCs/>
+        </w:rPr>
+        <w:t>Ingeniería Especializada:</w:t>
+      </w:r>
+      <w:r>
+        <w:t xml:space="preserve"> AutoCAD API, ETABS API, SAP2000, VBA/Macros avanzadas.</w:t>
+      </w:r>
+    </w:p>
+    <w:p/>
+    <w:p/>
+    <w:p>
+      <w:pPr>
+        <w:rPr>
+          <w:lang w:val="en-US"/>
+        </w:rPr>
+      </w:pPr>
+      <w:r>
+        <w:rPr>
+          <w:lang w:val="en-US"/>
+        </w:rPr>
+        <w:t>Building bridges between physical infrastructure and digital architecture.</w:t>
+      </w:r>
+    </w:p>
+    <w:p>
+      <w:pPr>
+        <w:rPr>
+          <w:lang w:val="en-US"/>
+        </w:rPr>
+      </w:pPr>
+      <w:r>
+        <w:rPr>
+          <w:lang w:val="en-US"/>
+        </w:rPr>
+        <w:t>My professional journey began with a fascination for Civil Engineering: the challenge of solving complex structural problems and driving real-world efficiency. However, I soon discovered that my true passion lies in applying that same analytical rigor to the world of Backend Development.</w:t>
+      </w:r>
+    </w:p>
+    <w:p>
+      <w:pPr>
+        <w:rPr>
+          <w:lang w:val="en-US"/>
+        </w:rPr>
+      </w:pPr>
+      <w:r>
+        <w:rPr>
+          <w:lang w:val="en-US"/>
+        </w:rPr>
+        <w:t>Today, I leverage my engineering background to design robust, scalable, and secure applications. I understand that just as a building requires solid foundations, an app needs an impeccable backend to sustain the weight of complex calculations and a diverse, growing user base.</w:t>
+      </w:r>
+    </w:p>
+    <w:p>
+      <w:pPr>
+        <w:rPr>
+          <w:lang w:val="en-US"/>
+        </w:rPr>
+      </w:pPr>
+      <w:r>
+        <w:rPr>
+          <w:lang w:val="en-US"/>
+        </w:rPr>
+        <w:t>I specialize in optimizing processes and automating solutions that once seemed impossible. I thrive on the challenge of taking an engineering problem and translating it into efficient programming logic that delivers tangible business value.</w:t>
+      </w:r>
+    </w:p>
+    <w:p>
+      <w:pPr>
+        <w:rPr>
+          <w:lang w:val="en-US"/>
+        </w:rPr>
+      </w:pPr>
+      <w:r>
+        <w:rPr>
+          <w:lang w:val="en-US"/>
+        </w:rPr>
+        <w:t>Let's Connect!</w:t>
+      </w:r>
+    </w:p>
+    <w:p>
+      <w:pPr>
+        <w:rPr>
+          <w:lang w:val="en-US"/>
+        </w:rPr>
+      </w:pPr>
+      <w:r>
+        <w:rPr>
+          <w:lang w:val="en-US"/>
+        </w:rPr>
+        <w:lastRenderedPageBreak/>
+        <w:t>I am always open to connecting with innovative minds, engineers looking to digitize their workflows, or teams in need of a backend developer with a unique structural vision.</w:t>
+      </w:r>
+    </w:p>
+    <w:p>
+      <w:pPr>
+        <w:rPr>
+          <w:lang w:val="en-US"/>
+        </w:rPr>
+      </w:pPr>
+    </w:p>
+    <w:p>
+      <w:pPr>
+        <w:rPr>
+          <w:lang w:val="en-US"/>
+        </w:rPr>
+      </w:pPr>
+      <w:r>
+        <w:rPr>
+          <w:lang w:val="en-US"/>
+        </w:rPr>
+        <w:t>My Tech Stack</w:t>
+      </w:r>
+    </w:p>
+    <w:p>
+      <w:pPr>
+        <w:rPr>
+          <w:lang w:val="en-US"/>
+        </w:rPr>
+      </w:pPr>
+      <w:r>
+        <w:rPr>
+          <w:lang w:val="en-US"/>
+        </w:rPr>
+        <w:t>I have built a versatile skill set designed for robustness and seamless integration:</w:t>
+      </w:r>
+    </w:p>
+    <w:p>
+      <w:pPr>
+        <w:rPr>
+          <w:lang w:val="en-US"/>
+        </w:rPr>
+      </w:pPr>
+      <w:r>
+        <w:rPr>
+          <w:lang w:val="en-US"/>
+        </w:rPr>
+        <w:t>Languages: C#, VB.NET, Python (Backend/Data), SQL, JavaScript.</w:t>
+      </w:r>
+    </w:p>
+    <w:p>
+      <w:pPr>
+        <w:rPr>
+          <w:lang w:val="en-US"/>
+        </w:rPr>
+      </w:pPr>
+      <w:r>
+        <w:rPr>
+          <w:lang w:val="en-US"/>
+        </w:rPr>
+        <w:t>Frameworks &amp; Desktop: .NET Core, .NET Framework, WPF, WinUI 3, MVVM Pattern, Entity Framework.</w:t>
+      </w:r>
+    </w:p>
+    <w:p>
+      <w:pPr>
+        <w:rPr>
+          <w:lang w:val="en-US"/>
+        </w:rPr>
+      </w:pPr>
+      <w:r>
+        <w:rPr>
+          <w:lang w:val="en-US"/>
+        </w:rPr>
+        <w:t>Cloud &amp; DevOps: AWS (EC2, S3, RDS, IAM), Docker, Git, CI/CD, n8n (Workflow Automation).</w:t>
+      </w:r>
+    </w:p>
+    <w:p>
+      <w:pPr>
+        <w:rPr>
+          <w:lang w:val="en-US"/>
+        </w:rPr>
+      </w:pPr>
+      <w:r>
+        <w:rPr>
+          <w:lang w:val="en-US"/>
+        </w:rPr>
+        <w:t>Databases: SQL Server, MySQL, MariaDB (Relational Design &amp; Stored Procedures).</w:t>
+      </w:r>
+    </w:p>
+    <w:p>
+      <w:pPr>
+        <w:rPr>
+          <w:lang w:val="en-US"/>
+        </w:rPr>
+      </w:pPr>
+      <w:r>
+        <w:rPr>
+          <w:lang w:val="en-US"/>
+        </w:rPr>
+        <w:t>Frontend: React (Basic), Tailwind CSS, API Integration.</w:t>
+      </w:r>
+    </w:p>
+    <w:p>
+      <w:pPr>
+        <w:rPr>
+          <w:lang w:val="en-US"/>
+        </w:rPr>
+      </w:pPr>
+      <w:r>
+        <w:rPr>
+          <w:lang w:val="en-US"/>
+        </w:rPr>
+        <w:t>Specialized Engineering: AutoCAD API, ETABS API, SAP2000, Advanced VBA/Macros.</w:t>
       </w:r>
     </w:p>
     <w:sectPr>
@@ -161,6 +1331,511 @@
     </w:sectPr>
   </w:body>
 </w:document>
+</file>
+
+<file path=word/numbering.xml><?xml version="1.0" encoding="utf-8"?>
+<w:numbering xmlns:wpc="http://schemas.microsoft.com/office/word/2010/wordprocessingCanvas" xmlns:cx="http://schemas.microsoft.com/office/drawing/2014/chartex" xmlns:cx1="http://schemas.microsoft.com/office/drawing/2015/9/8/chartex" xmlns:cx2="http://schemas.microsoft.com/office/drawing/2015/10/21/chartex" xmlns:cx3="http://schemas.microsoft.com/office/drawing/2016/5/9/chartex" xmlns:cx4="http://schemas.microsoft.com/office/drawing/2016/5/10/chartex" xmlns:cx5="http://schemas.microsoft.com/office/drawing/2016/5/11/chartex" xmlns:cx6="http://schemas.microsoft.com/office/drawing/2016/5/12/chartex" xmlns:cx7="http://schemas.microsoft.com/office/drawing/2016/5/13/chartex" xmlns:cx8="http://schemas.microsoft.com/office/drawing/2016/5/14/chartex" xmlns:mc="http://schemas.openxmlformats.org/markup-compatibility/2006" xmlns:aink="http://schemas.microsoft.com/office/drawing/2016/ink" xmlns:am3d="http://schemas.microsoft.com/office/drawing/2017/model3d" xmlns:o="urn:schemas-microsoft-com:office:office" xmlns:oel="http://schemas.microsoft.com/office/2019/extlst" xmlns:r="http://schemas.openxmlformats.org/officeDocument/2006/relationships" xmlns:m="http://schemas.openxmlformats.org/officeDocument/2006/math" xmlns:v="urn:schemas-microsoft-com:vml" xmlns:wp14="http://schemas.microsoft.com/office/word/2010/wordprocessingDrawing" xmlns:wp="http://schemas.openxmlformats.org/drawingml/2006/wordprocessingDrawing" xmlns:w10="urn:schemas-microsoft-com:office:word" xmlns:w="http://schemas.openxmlformats.org/wordprocessingml/2006/main" xmlns:w14="http://schemas.microsoft.com/office/word/2010/wordml" xmlns:w15="http://schemas.microsoft.com/office/word/2012/wordml" xmlns:w16cex="http://schemas.microsoft.com/office/word/2018/wordml/cex" xmlns:w16cid="http://schemas.microsoft.com/office/word/2016/wordml/cid" xmlns:w16="http://schemas.microsoft.com/office/word/2018/wordml" xmlns:w16du="http://schemas.microsoft.com/office/word/2023/wordml/word16du" xmlns:w16sdtdh="http://schemas.microsoft.com/office/word/2020/wordml/sdtdatahash" xmlns:w16sdtfl="http://schemas.microsoft.com/office/word/2024/wordml/sdtformatlock" xmlns:w16se="http://schemas.microsoft.com/office/word/2015/wordml/symex" xmlns:wpg="http://schemas.microsoft.com/office/word/2010/wordprocessingGroup" xmlns:wpi="http://schemas.microsoft.com/office/word/2010/wordprocessingInk" xmlns:wne="http://schemas.microsoft.com/office/word/2006/wordml" xmlns:wps="http://schemas.microsoft.com/office/word/2010/wordprocessingShape" mc:Ignorable="w14 w15 w16se w16cid w16 w16cex w16sdtdh w16sdtfl w16du wp14">
+  <w:abstractNum w:abstractNumId="0" w15:restartNumberingAfterBreak="0">
+    <w:nsid w:val="0F3F12D1"/>
+    <w:multiLevelType w:val="multilevel"/>
+    <w:tmpl w:val="FD9AC662"/>
+    <w:lvl w:ilvl="0">
+      <w:start w:val="1"/>
+      <w:numFmt w:val="bullet"/>
+      <w:lvlText w:val=""/>
+      <w:lvlJc w:val="left"/>
+      <w:pPr>
+        <w:tabs>
+          <w:tab w:val="num" w:pos="720"/>
+        </w:tabs>
+        <w:ind w:left="720" w:hanging="360"/>
+      </w:pPr>
+      <w:rPr>
+        <w:rFonts w:ascii="Symbol" w:hAnsi="Symbol" w:hint="default"/>
+        <w:sz w:val="20"/>
+      </w:rPr>
+    </w:lvl>
+    <w:lvl w:ilvl="1" w:tentative="1">
+      <w:start w:val="1"/>
+      <w:numFmt w:val="bullet"/>
+      <w:lvlText w:val="o"/>
+      <w:lvlJc w:val="left"/>
+      <w:pPr>
+        <w:tabs>
+          <w:tab w:val="num" w:pos="1440"/>
+        </w:tabs>
+        <w:ind w:left="1440" w:hanging="360"/>
+      </w:pPr>
+      <w:rPr>
+        <w:rFonts w:ascii="Courier New" w:hAnsi="Courier New" w:hint="default"/>
+        <w:sz w:val="20"/>
+      </w:rPr>
+    </w:lvl>
+    <w:lvl w:ilvl="2" w:tentative="1">
+      <w:start w:val="1"/>
+      <w:numFmt w:val="bullet"/>
+      <w:lvlText w:val=""/>
+      <w:lvlJc w:val="left"/>
+      <w:pPr>
+        <w:tabs>
+          <w:tab w:val="num" w:pos="2160"/>
+        </w:tabs>
+        <w:ind w:left="2160" w:hanging="360"/>
+      </w:pPr>
+      <w:rPr>
+        <w:rFonts w:ascii="Wingdings" w:hAnsi="Wingdings" w:hint="default"/>
+        <w:sz w:val="20"/>
+      </w:rPr>
+    </w:lvl>
+    <w:lvl w:ilvl="3" w:tentative="1">
+      <w:start w:val="1"/>
+      <w:numFmt w:val="bullet"/>
+      <w:lvlText w:val=""/>
+      <w:lvlJc w:val="left"/>
+      <w:pPr>
+        <w:tabs>
+          <w:tab w:val="num" w:pos="2880"/>
+        </w:tabs>
+        <w:ind w:left="2880" w:hanging="360"/>
+      </w:pPr>
+      <w:rPr>
+        <w:rFonts w:ascii="Wingdings" w:hAnsi="Wingdings" w:hint="default"/>
+        <w:sz w:val="20"/>
+      </w:rPr>
+    </w:lvl>
+    <w:lvl w:ilvl="4" w:tentative="1">
+      <w:start w:val="1"/>
+      <w:numFmt w:val="bullet"/>
+      <w:lvlText w:val=""/>
+      <w:lvlJc w:val="left"/>
+      <w:pPr>
+        <w:tabs>
+          <w:tab w:val="num" w:pos="3600"/>
+        </w:tabs>
+        <w:ind w:left="3600" w:hanging="360"/>
+      </w:pPr>
+      <w:rPr>
+        <w:rFonts w:ascii="Wingdings" w:hAnsi="Wingdings" w:hint="default"/>
+        <w:sz w:val="20"/>
+      </w:rPr>
+    </w:lvl>
+    <w:lvl w:ilvl="5" w:tentative="1">
+      <w:start w:val="1"/>
+      <w:numFmt w:val="bullet"/>
+      <w:lvlText w:val=""/>
+      <w:lvlJc w:val="left"/>
+      <w:pPr>
+        <w:tabs>
+          <w:tab w:val="num" w:pos="4320"/>
+        </w:tabs>
+        <w:ind w:left="4320" w:hanging="360"/>
+      </w:pPr>
+      <w:rPr>
+        <w:rFonts w:ascii="Wingdings" w:hAnsi="Wingdings" w:hint="default"/>
+        <w:sz w:val="20"/>
+      </w:rPr>
+    </w:lvl>
+    <w:lvl w:ilvl="6" w:tentative="1">
+      <w:start w:val="1"/>
+      <w:numFmt w:val="bullet"/>
+      <w:lvlText w:val=""/>
+      <w:lvlJc w:val="left"/>
+      <w:pPr>
+        <w:tabs>
+          <w:tab w:val="num" w:pos="5040"/>
+        </w:tabs>
+        <w:ind w:left="5040" w:hanging="360"/>
+      </w:pPr>
+      <w:rPr>
+        <w:rFonts w:ascii="Wingdings" w:hAnsi="Wingdings" w:hint="default"/>
+        <w:sz w:val="20"/>
+      </w:rPr>
+    </w:lvl>
+    <w:lvl w:ilvl="7" w:tentative="1">
+      <w:start w:val="1"/>
+      <w:numFmt w:val="bullet"/>
+      <w:lvlText w:val=""/>
+      <w:lvlJc w:val="left"/>
+      <w:pPr>
+        <w:tabs>
+          <w:tab w:val="num" w:pos="5760"/>
+        </w:tabs>
+        <w:ind w:left="5760" w:hanging="360"/>
+      </w:pPr>
+      <w:rPr>
+        <w:rFonts w:ascii="Wingdings" w:hAnsi="Wingdings" w:hint="default"/>
+        <w:sz w:val="20"/>
+      </w:rPr>
+    </w:lvl>
+    <w:lvl w:ilvl="8" w:tentative="1">
+      <w:start w:val="1"/>
+      <w:numFmt w:val="bullet"/>
+      <w:lvlText w:val=""/>
+      <w:lvlJc w:val="left"/>
+      <w:pPr>
+        <w:tabs>
+          <w:tab w:val="num" w:pos="6480"/>
+        </w:tabs>
+        <w:ind w:left="6480" w:hanging="360"/>
+      </w:pPr>
+      <w:rPr>
+        <w:rFonts w:ascii="Wingdings" w:hAnsi="Wingdings" w:hint="default"/>
+        <w:sz w:val="20"/>
+      </w:rPr>
+    </w:lvl>
+  </w:abstractNum>
+  <w:abstractNum w:abstractNumId="1" w15:restartNumberingAfterBreak="0">
+    <w:nsid w:val="707500AB"/>
+    <w:multiLevelType w:val="multilevel"/>
+    <w:tmpl w:val="AF8AC848"/>
+    <w:lvl w:ilvl="0">
+      <w:start w:val="1"/>
+      <w:numFmt w:val="decimal"/>
+      <w:lvlText w:val="%1."/>
+      <w:lvlJc w:val="left"/>
+      <w:pPr>
+        <w:tabs>
+          <w:tab w:val="num" w:pos="720"/>
+        </w:tabs>
+        <w:ind w:left="720" w:hanging="360"/>
+      </w:pPr>
+    </w:lvl>
+    <w:lvl w:ilvl="1" w:tentative="1">
+      <w:start w:val="1"/>
+      <w:numFmt w:val="decimal"/>
+      <w:lvlText w:val="%2."/>
+      <w:lvlJc w:val="left"/>
+      <w:pPr>
+        <w:tabs>
+          <w:tab w:val="num" w:pos="1440"/>
+        </w:tabs>
+        <w:ind w:left="1440" w:hanging="360"/>
+      </w:pPr>
+    </w:lvl>
+    <w:lvl w:ilvl="2" w:tentative="1">
+      <w:start w:val="1"/>
+      <w:numFmt w:val="decimal"/>
+      <w:lvlText w:val="%3."/>
+      <w:lvlJc w:val="left"/>
+      <w:pPr>
+        <w:tabs>
+          <w:tab w:val="num" w:pos="2160"/>
+        </w:tabs>
+        <w:ind w:left="2160" w:hanging="360"/>
+      </w:pPr>
+    </w:lvl>
+    <w:lvl w:ilvl="3" w:tentative="1">
+      <w:start w:val="1"/>
+      <w:numFmt w:val="decimal"/>
+      <w:lvlText w:val="%4."/>
+      <w:lvlJc w:val="left"/>
+      <w:pPr>
+        <w:tabs>
+          <w:tab w:val="num" w:pos="2880"/>
+        </w:tabs>
+        <w:ind w:left="2880" w:hanging="360"/>
+      </w:pPr>
+    </w:lvl>
+    <w:lvl w:ilvl="4" w:tentative="1">
+      <w:start w:val="1"/>
+      <w:numFmt w:val="decimal"/>
+      <w:lvlText w:val="%5."/>
+      <w:lvlJc w:val="left"/>
+      <w:pPr>
+        <w:tabs>
+          <w:tab w:val="num" w:pos="3600"/>
+        </w:tabs>
+        <w:ind w:left="3600" w:hanging="360"/>
+      </w:pPr>
+    </w:lvl>
+    <w:lvl w:ilvl="5" w:tentative="1">
+      <w:start w:val="1"/>
+      <w:numFmt w:val="decimal"/>
+      <w:lvlText w:val="%6."/>
+      <w:lvlJc w:val="left"/>
+      <w:pPr>
+        <w:tabs>
+          <w:tab w:val="num" w:pos="4320"/>
+        </w:tabs>
+        <w:ind w:left="4320" w:hanging="360"/>
+      </w:pPr>
+    </w:lvl>
+    <w:lvl w:ilvl="6" w:tentative="1">
+      <w:start w:val="1"/>
+      <w:numFmt w:val="decimal"/>
+      <w:lvlText w:val="%7."/>
+      <w:lvlJc w:val="left"/>
+      <w:pPr>
+        <w:tabs>
+          <w:tab w:val="num" w:pos="5040"/>
+        </w:tabs>
+        <w:ind w:left="5040" w:hanging="360"/>
+      </w:pPr>
+    </w:lvl>
+    <w:lvl w:ilvl="7" w:tentative="1">
+      <w:start w:val="1"/>
+      <w:numFmt w:val="decimal"/>
+      <w:lvlText w:val="%8."/>
+      <w:lvlJc w:val="left"/>
+      <w:pPr>
+        <w:tabs>
+          <w:tab w:val="num" w:pos="5760"/>
+        </w:tabs>
+        <w:ind w:left="5760" w:hanging="360"/>
+      </w:pPr>
+    </w:lvl>
+    <w:lvl w:ilvl="8" w:tentative="1">
+      <w:start w:val="1"/>
+      <w:numFmt w:val="decimal"/>
+      <w:lvlText w:val="%9."/>
+      <w:lvlJc w:val="left"/>
+      <w:pPr>
+        <w:tabs>
+          <w:tab w:val="num" w:pos="6480"/>
+        </w:tabs>
+        <w:ind w:left="6480" w:hanging="360"/>
+      </w:pPr>
+    </w:lvl>
+  </w:abstractNum>
+  <w:abstractNum w:abstractNumId="2" w15:restartNumberingAfterBreak="0">
+    <w:nsid w:val="75C2531A"/>
+    <w:multiLevelType w:val="multilevel"/>
+    <w:tmpl w:val="CA5A7BE4"/>
+    <w:lvl w:ilvl="0">
+      <w:start w:val="1"/>
+      <w:numFmt w:val="decimal"/>
+      <w:lvlText w:val="%1."/>
+      <w:lvlJc w:val="left"/>
+      <w:pPr>
+        <w:tabs>
+          <w:tab w:val="num" w:pos="720"/>
+        </w:tabs>
+        <w:ind w:left="720" w:hanging="360"/>
+      </w:pPr>
+    </w:lvl>
+    <w:lvl w:ilvl="1" w:tentative="1">
+      <w:start w:val="1"/>
+      <w:numFmt w:val="decimal"/>
+      <w:lvlText w:val="%2."/>
+      <w:lvlJc w:val="left"/>
+      <w:pPr>
+        <w:tabs>
+          <w:tab w:val="num" w:pos="1440"/>
+        </w:tabs>
+        <w:ind w:left="1440" w:hanging="360"/>
+      </w:pPr>
+    </w:lvl>
+    <w:lvl w:ilvl="2" w:tentative="1">
+      <w:start w:val="1"/>
+      <w:numFmt w:val="decimal"/>
+      <w:lvlText w:val="%3."/>
+      <w:lvlJc w:val="left"/>
+      <w:pPr>
+        <w:tabs>
+          <w:tab w:val="num" w:pos="2160"/>
+        </w:tabs>
+        <w:ind w:left="2160" w:hanging="360"/>
+      </w:pPr>
+    </w:lvl>
+    <w:lvl w:ilvl="3" w:tentative="1">
+      <w:start w:val="1"/>
+      <w:numFmt w:val="decimal"/>
+      <w:lvlText w:val="%4."/>
+      <w:lvlJc w:val="left"/>
+      <w:pPr>
+        <w:tabs>
+          <w:tab w:val="num" w:pos="2880"/>
+        </w:tabs>
+        <w:ind w:left="2880" w:hanging="360"/>
+      </w:pPr>
+    </w:lvl>
+    <w:lvl w:ilvl="4" w:tentative="1">
+      <w:start w:val="1"/>
+      <w:numFmt w:val="decimal"/>
+      <w:lvlText w:val="%5."/>
+      <w:lvlJc w:val="left"/>
+      <w:pPr>
+        <w:tabs>
+          <w:tab w:val="num" w:pos="3600"/>
+        </w:tabs>
+        <w:ind w:left="3600" w:hanging="360"/>
+      </w:pPr>
+    </w:lvl>
+    <w:lvl w:ilvl="5" w:tentative="1">
+      <w:start w:val="1"/>
+      <w:numFmt w:val="decimal"/>
+      <w:lvlText w:val="%6."/>
+      <w:lvlJc w:val="left"/>
+      <w:pPr>
+        <w:tabs>
+          <w:tab w:val="num" w:pos="4320"/>
+        </w:tabs>
+        <w:ind w:left="4320" w:hanging="360"/>
+      </w:pPr>
+    </w:lvl>
+    <w:lvl w:ilvl="6" w:tentative="1">
+      <w:start w:val="1"/>
+      <w:numFmt w:val="decimal"/>
+      <w:lvlText w:val="%7."/>
+      <w:lvlJc w:val="left"/>
+      <w:pPr>
+        <w:tabs>
+          <w:tab w:val="num" w:pos="5040"/>
+        </w:tabs>
+        <w:ind w:left="5040" w:hanging="360"/>
+      </w:pPr>
+    </w:lvl>
+    <w:lvl w:ilvl="7" w:tentative="1">
+      <w:start w:val="1"/>
+      <w:numFmt w:val="decimal"/>
+      <w:lvlText w:val="%8."/>
+      <w:lvlJc w:val="left"/>
+      <w:pPr>
+        <w:tabs>
+          <w:tab w:val="num" w:pos="5760"/>
+        </w:tabs>
+        <w:ind w:left="5760" w:hanging="360"/>
+      </w:pPr>
+    </w:lvl>
+    <w:lvl w:ilvl="8" w:tentative="1">
+      <w:start w:val="1"/>
+      <w:numFmt w:val="decimal"/>
+      <w:lvlText w:val="%9."/>
+      <w:lvlJc w:val="left"/>
+      <w:pPr>
+        <w:tabs>
+          <w:tab w:val="num" w:pos="6480"/>
+        </w:tabs>
+        <w:ind w:left="6480" w:hanging="360"/>
+      </w:pPr>
+    </w:lvl>
+  </w:abstractNum>
+  <w:abstractNum w:abstractNumId="3" w15:restartNumberingAfterBreak="0">
+    <w:nsid w:val="7F9D76DA"/>
+    <w:multiLevelType w:val="multilevel"/>
+    <w:tmpl w:val="D2EAE31A"/>
+    <w:lvl w:ilvl="0">
+      <w:start w:val="1"/>
+      <w:numFmt w:val="decimal"/>
+      <w:lvlText w:val="%1."/>
+      <w:lvlJc w:val="left"/>
+      <w:pPr>
+        <w:tabs>
+          <w:tab w:val="num" w:pos="720"/>
+        </w:tabs>
+        <w:ind w:left="720" w:hanging="360"/>
+      </w:pPr>
+    </w:lvl>
+    <w:lvl w:ilvl="1" w:tentative="1">
+      <w:start w:val="1"/>
+      <w:numFmt w:val="decimal"/>
+      <w:lvlText w:val="%2."/>
+      <w:lvlJc w:val="left"/>
+      <w:pPr>
+        <w:tabs>
+          <w:tab w:val="num" w:pos="1440"/>
+        </w:tabs>
+        <w:ind w:left="1440" w:hanging="360"/>
+      </w:pPr>
+    </w:lvl>
+    <w:lvl w:ilvl="2" w:tentative="1">
+      <w:start w:val="1"/>
+      <w:numFmt w:val="decimal"/>
+      <w:lvlText w:val="%3."/>
+      <w:lvlJc w:val="left"/>
+      <w:pPr>
+        <w:tabs>
+          <w:tab w:val="num" w:pos="2160"/>
+        </w:tabs>
+        <w:ind w:left="2160" w:hanging="360"/>
+      </w:pPr>
+    </w:lvl>
+    <w:lvl w:ilvl="3" w:tentative="1">
+      <w:start w:val="1"/>
+      <w:numFmt w:val="decimal"/>
+      <w:lvlText w:val="%4."/>
+      <w:lvlJc w:val="left"/>
+      <w:pPr>
+        <w:tabs>
+          <w:tab w:val="num" w:pos="2880"/>
+        </w:tabs>
+        <w:ind w:left="2880" w:hanging="360"/>
+      </w:pPr>
+    </w:lvl>
+    <w:lvl w:ilvl="4" w:tentative="1">
+      <w:start w:val="1"/>
+      <w:numFmt w:val="decimal"/>
+      <w:lvlText w:val="%5."/>
+      <w:lvlJc w:val="left"/>
+      <w:pPr>
+        <w:tabs>
+          <w:tab w:val="num" w:pos="3600"/>
+        </w:tabs>
+        <w:ind w:left="3600" w:hanging="360"/>
+      </w:pPr>
+    </w:lvl>
+    <w:lvl w:ilvl="5" w:tentative="1">
+      <w:start w:val="1"/>
+      <w:numFmt w:val="decimal"/>
+      <w:lvlText w:val="%6."/>
+      <w:lvlJc w:val="left"/>
+      <w:pPr>
+        <w:tabs>
+          <w:tab w:val="num" w:pos="4320"/>
+        </w:tabs>
+        <w:ind w:left="4320" w:hanging="360"/>
+      </w:pPr>
+    </w:lvl>
+    <w:lvl w:ilvl="6" w:tentative="1">
+      <w:start w:val="1"/>
+      <w:numFmt w:val="decimal"/>
+      <w:lvlText w:val="%7."/>
+      <w:lvlJc w:val="left"/>
+      <w:pPr>
+        <w:tabs>
+          <w:tab w:val="num" w:pos="5040"/>
+        </w:tabs>
+        <w:ind w:left="5040" w:hanging="360"/>
+      </w:pPr>
+    </w:lvl>
+    <w:lvl w:ilvl="7" w:tentative="1">
+      <w:start w:val="1"/>
+      <w:numFmt w:val="decimal"/>
+      <w:lvlText w:val="%8."/>
+      <w:lvlJc w:val="left"/>
+      <w:pPr>
+        <w:tabs>
+          <w:tab w:val="num" w:pos="5760"/>
+        </w:tabs>
+        <w:ind w:left="5760" w:hanging="360"/>
+      </w:pPr>
+    </w:lvl>
+    <w:lvl w:ilvl="8" w:tentative="1">
+      <w:start w:val="1"/>
+      <w:numFmt w:val="decimal"/>
+      <w:lvlText w:val="%9."/>
+      <w:lvlJc w:val="left"/>
+      <w:pPr>
+        <w:tabs>
+          <w:tab w:val="num" w:pos="6480"/>
+        </w:tabs>
+        <w:ind w:left="6480" w:hanging="360"/>
+      </w:pPr>
+    </w:lvl>
+  </w:abstractNum>
+  <w:num w:numId="1" w16cid:durableId="261843462">
+    <w:abstractNumId w:val="3"/>
+  </w:num>
+  <w:num w:numId="2" w16cid:durableId="247201960">
+    <w:abstractNumId w:val="1"/>
+  </w:num>
+  <w:num w:numId="3" w16cid:durableId="987979782">
+    <w:abstractNumId w:val="2"/>
+  </w:num>
+  <w:num w:numId="4" w16cid:durableId="275061383">
+    <w:abstractNumId w:val="0"/>
+  </w:num>
+</w:numbering>
 </file>
 
 <file path=word/styles.xml><?xml version="1.0" encoding="utf-8"?>
@@ -766,7 +2441,6 @@
   <w:style w:type="character" w:default="1" w:styleId="Fuentedeprrafopredeter">
     <w:name w:val="Default Paragraph Font"/>
     <w:uiPriority w:val="1"/>
-    <w:semiHidden/>
     <w:unhideWhenUsed/>
   </w:style>
   <w:style w:type="table" w:default="1" w:styleId="Tablanormal">

</xml_diff>